<commit_message>
Realização de arquivos e estruturas para separação de imagem e texto para o Word
</commit_message>
<xml_diff>
--- a/backend/files/output/teste.docx
+++ b/backend/files/output/teste.docx
@@ -4,9 +4,14 @@
   <w:body>
     <w:p>
       <w:r>
+        <w:t xml:space="preserve">Teste de PDF para sistema de conversor de Word </w:t>
+      </w:r>
+    </w:p>
+    <w:p>
+      <w:r>
         <w:drawing>
           <wp:inline xmlns:a="http://schemas.openxmlformats.org/drawingml/2006/main" xmlns:pic="http://schemas.openxmlformats.org/drawingml/2006/picture">
-            <wp:extent cx="5486400" cy="7750921"/>
+            <wp:extent cx="3657600" cy="3657600"/>
             <wp:docPr id="1" name="Picture 1"/>
             <wp:cNvGraphicFramePr>
               <a:graphicFrameLocks noChangeAspect="1"/>
@@ -15,7 +20,7 @@
               <a:graphicData uri="http://schemas.openxmlformats.org/drawingml/2006/picture">
                 <pic:pic>
                   <pic:nvPicPr>
-                    <pic:cNvPr id="0" name="temp_page_0.png"/>
+                    <pic:cNvPr id="0" name="temp_img_0_117.33001708984375.png"/>
                     <pic:cNvPicPr/>
                   </pic:nvPicPr>
                   <pic:blipFill>
@@ -27,7 +32,7 @@
                   <pic:spPr>
                     <a:xfrm>
                       <a:off x="0" y="0"/>
-                      <a:ext cx="5486400" cy="7750921"/>
+                      <a:ext cx="3657600" cy="3657600"/>
                     </a:xfrm>
                     <a:prstGeom prst="rect"/>
                   </pic:spPr>

</xml_diff>